<commit_message>
Final portfolio refinements and link updates
</commit_message>
<xml_diff>
--- a/resume/akash resume updated.docx
+++ b/resume/akash resume updated.docx
@@ -151,23 +151,14 @@
         <w:t xml:space="preserve">  ·  </w:t>
       </w:r>
       <w:r>
-        <w:fldChar w:fldCharType="begin"/>
-      </w:r>
-      <w:r>
-        <w:instrText xml:space="preserve"> HYPERLINK "https://ogakashportfolio.netlify.app" </w:instrText>
-      </w:r>
-      <w:r>
-        <w:fldChar w:fldCharType="separate"/>
-      </w:r>
-      <w:r>
         <w:rPr>
           <w:rFonts w:ascii="Arial" w:hAnsi="Arial" w:eastAsia="Arial" w:cs="Arial"/>
           <w:color w:val="1A56A0"/>
           <w:sz w:val="16"/>
           <w:szCs w:val="16"/>
-          <w:u w:val="single"/>
-        </w:rPr>
-        <w:t>Portfolio</w:t>
+          <w:u w:val="none"/>
+        </w:rPr>
+        <w:fldChar w:fldCharType="begin"/>
       </w:r>
       <w:r>
         <w:rPr>
@@ -175,10 +166,41 @@
           <w:color w:val="1A56A0"/>
           <w:sz w:val="16"/>
           <w:szCs w:val="16"/>
-          <w:u w:val="single"/>
+          <w:u w:val="none"/>
+        </w:rPr>
+        <w:instrText xml:space="preserve"> HYPERLINK "ogakash.netlify.app" </w:instrText>
+      </w:r>
+      <w:r>
+        <w:rPr>
+          <w:rFonts w:ascii="Arial" w:hAnsi="Arial" w:eastAsia="Arial" w:cs="Arial"/>
+          <w:color w:val="1A56A0"/>
+          <w:sz w:val="16"/>
+          <w:szCs w:val="16"/>
+          <w:u w:val="none"/>
+        </w:rPr>
+        <w:fldChar w:fldCharType="separate"/>
+      </w:r>
+      <w:r>
+        <w:rPr>
+          <w:rStyle w:val="15"/>
+          <w:rFonts w:ascii="Arial" w:hAnsi="Arial" w:eastAsia="Arial" w:cs="Arial"/>
+          <w:sz w:val="16"/>
+          <w:szCs w:val="16"/>
+        </w:rPr>
+        <w:t>Portfolio</w:t>
+      </w:r>
+      <w:r>
+        <w:rPr>
+          <w:rFonts w:ascii="Arial" w:hAnsi="Arial" w:eastAsia="Arial" w:cs="Arial"/>
+          <w:color w:val="1A56A0"/>
+          <w:sz w:val="16"/>
+          <w:szCs w:val="16"/>
+          <w:u w:val="none"/>
         </w:rPr>
         <w:fldChar w:fldCharType="end"/>
       </w:r>
+      <w:bookmarkStart w:id="0" w:name="_GoBack"/>
+      <w:bookmarkEnd w:id="0"/>
     </w:p>
     <w:p>
       <w:pPr>
@@ -879,21 +901,7 @@
           <w:szCs w:val="19"/>
           <w:lang w:val="en-US"/>
         </w:rPr>
-        <w:t>Take a lo</w:t>
-      </w:r>
-      <w:bookmarkStart w:id="0" w:name="_GoBack"/>
-      <w:bookmarkEnd w:id="0"/>
-      <w:r>
-        <w:rPr>
-          <w:rStyle w:val="12"/>
-          <w:rFonts w:hint="default" w:cs="Arial"/>
-          <w:b w:val="0"/>
-          <w:bCs w:val="0"/>
-          <w:sz w:val="19"/>
-          <w:szCs w:val="19"/>
-          <w:lang w:val="en-US"/>
-        </w:rPr>
-        <w:t>ok</w:t>
+        <w:t>Take a look</w:t>
       </w:r>
       <w:r>
         <w:rPr>
@@ -1097,6 +1105,12 @@
             <w:insideH w:val="single" w:color="auto" w:sz="4" w:space="0"/>
             <w:insideV w:val="single" w:color="auto" w:sz="4" w:space="0"/>
           </w:tblBorders>
+          <w:tblCellMar>
+            <w:top w:w="0" w:type="dxa"/>
+            <w:left w:w="10" w:type="dxa"/>
+            <w:bottom w:w="0" w:type="dxa"/>
+            <w:right w:w="10" w:type="dxa"/>
+          </w:tblCellMar>
         </w:tblPrEx>
         <w:tc>
           <w:tcPr>
@@ -1999,7 +2013,7 @@
     <w:lsdException w:unhideWhenUsed="0" w:uiPriority="0" w:semiHidden="0" w:name="Body Text Indent 3"/>
     <w:lsdException w:unhideWhenUsed="0" w:uiPriority="0" w:semiHidden="0" w:name="Block Text"/>
     <w:lsdException w:qFormat="1" w:uiPriority="99" w:semiHidden="0" w:name="Hyperlink"/>
-    <w:lsdException w:unhideWhenUsed="0" w:uiPriority="0" w:semiHidden="0" w:name="FollowedHyperlink"/>
+    <w:lsdException w:qFormat="1" w:unhideWhenUsed="0" w:uiPriority="0" w:semiHidden="0" w:name="FollowedHyperlink"/>
     <w:lsdException w:qFormat="1" w:unhideWhenUsed="0" w:uiPriority="0" w:semiHidden="0" w:name="Strong"/>
     <w:lsdException w:qFormat="1" w:unhideWhenUsed="0" w:uiPriority="0" w:semiHidden="0" w:name="Emphasis"/>
     <w:lsdException w:unhideWhenUsed="0" w:uiPriority="0" w:semiHidden="0" w:name="Document Map"/>
@@ -2296,6 +2310,7 @@
   <w:style w:type="character" w:styleId="12">
     <w:name w:val="FollowedHyperlink"/>
     <w:basedOn w:val="8"/>
+    <w:qFormat/>
     <w:uiPriority w:val="0"/>
     <w:rPr>
       <w:color w:val="800080"/>

</xml_diff>

<commit_message>
Complete portfolio update with all recent changes
</commit_message>
<xml_diff>
--- a/resume/akash resume updated.docx
+++ b/resume/akash resume updated.docx
@@ -168,7 +168,7 @@
           <w:szCs w:val="16"/>
           <w:u w:val="none"/>
         </w:rPr>
-        <w:instrText xml:space="preserve"> HYPERLINK "ogakash.netlify.app" </w:instrText>
+        <w:instrText xml:space="preserve"> HYPERLINK "https://ogakash.netlify.app/" </w:instrText>
       </w:r>
       <w:r>
         <w:rPr>
@@ -182,7 +182,7 @@
       </w:r>
       <w:r>
         <w:rPr>
-          <w:rStyle w:val="15"/>
+          <w:rStyle w:val="12"/>
           <w:rFonts w:ascii="Arial" w:hAnsi="Arial" w:eastAsia="Arial" w:cs="Arial"/>
           <w:sz w:val="16"/>
           <w:szCs w:val="16"/>
@@ -199,8 +199,6 @@
         </w:rPr>
         <w:fldChar w:fldCharType="end"/>
       </w:r>
-      <w:bookmarkStart w:id="0" w:name="_GoBack"/>
-      <w:bookmarkEnd w:id="0"/>
     </w:p>
     <w:p>
       <w:pPr>
@@ -229,6 +227,8 @@
         </w:rPr>
         <w:t xml:space="preserve">MCA student and Full-Stack Developer skilled in React 19, TypeScript, Node.js, Electron, and Firebase. Currently interning at Ramco </w:t>
       </w:r>
+      <w:bookmarkStart w:id="0" w:name="_GoBack"/>
+      <w:bookmarkEnd w:id="0"/>
     </w:p>
     <w:p>
       <w:pPr>

</xml_diff>